<commit_message>
Uploads - 09092026 1104
</commit_message>
<xml_diff>
--- a/uploads/Proposta/PropostaCREDENCIAMENTO_LATAM RETAIL_.docx
+++ b/uploads/Proposta/PropostaCREDENCIAMENTO_LATAM RETAIL_.docx
@@ -273,7 +273,7 @@
                 <w:szCs w:val="24"/>
                 <w:u w:val="single"/>
               </w:rPr>
-              <w:t xml:space="preserve">LATAM RETAIL – Local: EXPO CENTER NORTE </w:t>
+              <w:t xml:space="preserve">LATAM RETAIL – Local: DISTRITO ANHEMBI </w:t>
             </w:r>
           </w:p>
         </w:tc>
@@ -333,7 +333,7 @@
                 <w:szCs w:val="24"/>
                 <w:u w:val="single"/>
               </w:rPr>
-              <w:t xml:space="preserve"/>
+              <w:t xml:space="preserve">PALÁCIO DAS CONVENÇÕES</w:t>
             </w:r>
           </w:p>
         </w:tc>
@@ -1004,7 +1004,7 @@
           <w:sz w:val="24"/>
           <w:szCs w:val="24"/>
         </w:rPr>
-        <w:t xml:space="preserve">• 2 TéCnico De Ti, 4 Diária(s), de: 14/09/2026 até: 17/09/2026</w:t>
+        <w:t xml:space="preserve">• 1 Coordenador De Staff, (PALÁCIO DAS CONVENÇÕES), 3 Diária(s), de: 15/09/2026 até: 17/09/2026</w:t>
       </w:r>
     </w:p>
     <w:p>
@@ -1024,7 +1024,7 @@
           <w:sz w:val="24"/>
           <w:szCs w:val="24"/>
         </w:rPr>
-        <w:t xml:space="preserve">• 4 Recepcionista Mono, (TOTEM), 1 Diária(s), de: 17/09/2026 até: 17/09/2026</w:t>
+        <w:t xml:space="preserve">• 2 TéCnico De Ti, 4 Diária(s), de: 14/09/2026 até: 17/09/2026</w:t>
       </w:r>
     </w:p>
     <w:p>
@@ -1044,7 +1044,7 @@
           <w:sz w:val="24"/>
           <w:szCs w:val="24"/>
         </w:rPr>
-        <w:t xml:space="preserve">• 8 Recepcionista Mono, (TOTEM), 1 Diária(s), de: 15/09/2026 até: 15/09/2026</w:t>
+        <w:t xml:space="preserve">• 2 Recepcionista Mono, (TOTEM), 1 Diária(s), de: 17/09/2026 até: 17/09/2026</w:t>
       </w:r>
     </w:p>
     <w:p>
@@ -1064,7 +1064,27 @@
           <w:sz w:val="24"/>
           <w:szCs w:val="24"/>
         </w:rPr>
-        <w:t xml:space="preserve">• 6 Recepcionista Mono, (TOTEM), 1 Diária(s), de: 16/09/2026 até: 16/09/2026</w:t>
+        <w:t xml:space="preserve">• 8 Recepcionista Mono, (TOTEM), 1 Diária(s), de: 15/09/2026 até: 15/09/2026</w:t>
+      </w:r>
+    </w:p>
+    <w:p>
+      <w:pPr>
+        <w:pStyle w:val="PargrafodaLista"/>
+        <w:spacing w:line="285" w:lineRule="atLeast"/>
+        <w:ind w:left="0"/>
+        <w:rPr>
+          <w:rFonts w:ascii="Abel" w:hAnsi="Abel"/>
+          <w:sz w:val="24"/>
+          <w:szCs w:val="24"/>
+        </w:rPr>
+      </w:pPr>
+      <w:r>
+        <w:rPr>
+          <w:rFonts w:ascii="Abel" w:hAnsi="Abel"/>
+          <w:sz w:val="24"/>
+          <w:szCs w:val="24"/>
+        </w:rPr>
+        <w:t xml:space="preserve">• 4 Recepcionista Mono, (TOTEM), 1 Diária(s), de: 16/09/2026 até: 16/09/2026</w:t>
       </w:r>
     </w:p>
     <w:p>
@@ -1157,7 +1177,7 @@
           <w:sz w:val="24"/>
           <w:szCs w:val="24"/>
         </w:rPr>
-        <w:t xml:space="preserve">• 1 Impressora De Etiqueta, 1 Diária(s), de: 17/09/2026 até: 17/09/2026</w:t>
+        <w:t xml:space="preserve">• 1 Impressora De Etiqueta, 2 Diária(s), de: 16/09/2026 até: 17/09/2026</w:t>
       </w:r>
     </w:p>
     <w:p>
@@ -1177,7 +1197,7 @@
           <w:sz w:val="24"/>
           <w:szCs w:val="24"/>
         </w:rPr>
-        <w:t xml:space="preserve">• 1 Impressora De Etiqueta, 1 Diária(s), de: 17/09/2026 até: 17/09/2026</w:t>
+        <w:t xml:space="preserve">• 1 Sistema De Credenciamento, 1 Diária(s), de: 16/09/2026 até: 16/09/2026</w:t>
       </w:r>
     </w:p>
     <w:p>
@@ -1197,7 +1217,7 @@
           <w:sz w:val="24"/>
           <w:szCs w:val="24"/>
         </w:rPr>
-        <w:t xml:space="preserve">• 1 Sistema De Credenciamento, 1 Diária(s), de: 16/09/2026 até: 16/09/2026</w:t>
+        <w:t xml:space="preserve">• 2 Celular Leitor, 3 Diária(s), de: 15/09/2026 até: 17/09/2026</w:t>
       </w:r>
     </w:p>
     <w:p>
@@ -1217,7 +1237,7 @@
           <w:sz w:val="24"/>
           <w:szCs w:val="24"/>
         </w:rPr>
-        <w:t xml:space="preserve">• 2 Celular Leitor, 3 Diária(s), de: 15/09/2026 até: 17/09/2026</w:t>
+        <w:t xml:space="preserve">• 2 Impressora De Etiqueta, 1 Diária(s), de: 15/09/2026 até: 15/09/2026</w:t>
       </w:r>
     </w:p>
     <w:p>
@@ -1237,7 +1257,7 @@
           <w:sz w:val="24"/>
           <w:szCs w:val="24"/>
         </w:rPr>
-        <w:t xml:space="preserve">• 2 Impressora De Etiqueta, 1 Diária(s), de: 15/09/2026 até: 15/09/2026</w:t>
+        <w:t xml:space="preserve">• 2 Notebook, 1 Diária(s), de: 16/09/2026 até: 16/09/2026</w:t>
       </w:r>
     </w:p>
     <w:p>
@@ -1257,7 +1277,7 @@
           <w:sz w:val="24"/>
           <w:szCs w:val="24"/>
         </w:rPr>
-        <w:t xml:space="preserve">• 2 Notebook, 1 Diária(s), de: 16/09/2026 até: 16/09/2026</w:t>
+        <w:t xml:space="preserve">• 2 Notebook, 1 Diária(s), de: 17/09/2026 até: 17/09/2026</w:t>
       </w:r>
     </w:p>
     <w:p>
@@ -1277,7 +1297,7 @@
           <w:sz w:val="24"/>
           <w:szCs w:val="24"/>
         </w:rPr>
-        <w:t xml:space="preserve">• 2 Notebook, 1 Diária(s), de: 17/09/2026 até: 17/09/2026</w:t>
+        <w:t xml:space="preserve">• 2 Totem Completo, 1 Diária(s), de: 17/09/2026 até: 17/09/2026</w:t>
       </w:r>
     </w:p>
     <w:p>
@@ -1317,27 +1337,7 @@
           <w:sz w:val="24"/>
           <w:szCs w:val="24"/>
         </w:rPr>
-        <w:t xml:space="preserve">• 4 Totem Completo, 1 Diária(s), de: 17/09/2026 até: 17/09/2026</w:t>
-      </w:r>
-    </w:p>
-    <w:p>
-      <w:pPr>
-        <w:pStyle w:val="PargrafodaLista"/>
-        <w:spacing w:line="285" w:lineRule="atLeast"/>
-        <w:ind w:left="0"/>
-        <w:rPr>
-          <w:rFonts w:ascii="Abel" w:hAnsi="Abel"/>
-          <w:sz w:val="24"/>
-          <w:szCs w:val="24"/>
-        </w:rPr>
-      </w:pPr>
-      <w:r>
-        <w:rPr>
-          <w:rFonts w:ascii="Abel" w:hAnsi="Abel"/>
-          <w:sz w:val="24"/>
-          <w:szCs w:val="24"/>
-        </w:rPr>
-        <w:t xml:space="preserve">• 6 Totem Completo, 1 Diária(s), de: 16/09/2026 até: 16/09/2026</w:t>
+        <w:t xml:space="preserve">• 4 Totem Completo, 1 Diária(s), de: 16/09/2026 até: 16/09/2026</w:t>
       </w:r>
     </w:p>
     <w:p>
@@ -1632,7 +1632,7 @@
           <w:sz w:val="24"/>
           <w:szCs w:val="24"/>
         </w:rPr>
-        <w:t xml:space="preserve">R$ 40.580,44</w:t>
+        <w:t xml:space="preserve">R$ 40.000,00</w:t>
       </w:r>
       <w:r>
         <w:rPr>
@@ -1811,7 +1811,7 @@
           <w:i/>
           <w:iCs/>
         </w:rPr>
-        <w:t xml:space="preserve">27/08/2026</w:t>
+        <w:t xml:space="preserve">04/09/2026</w:t>
       </w:r>
     </w:p>
     <w:p>

</xml_diff>